<commit_message>
Rebuild deck on the SRM CTECH 4:3 template; add register numbers to report
Co-Authored-By: Claude Sonnet 5.5 <noreply@anthropic.com>
Claude-Session: https://claude.ai/code/session_01DuJtm1bHy6SxuGUPpHM4Ua
</commit_message>
<xml_diff>
--- a/zeroth_review/Zeroth_Review_Report.docx
+++ b/zeroth_review/Zeroth_Review_Report.docx
@@ -313,7 +313,7 @@
                 <w:i w:val="0"/>
                 <w:sz w:val="20"/>
               </w:rPr>
-              <w:t>Dr. Eliazer M, Associate Professor, Department of Computing Technologies</w:t>
+              <w:t>Dr. M. Eliazer, Associate Professor, Department of Computing Technologies</w:t>
             </w:r>
           </w:p>
         </w:tc>
@@ -627,10 +627,9 @@
               <w:rPr>
                 <w:b w:val="0"/>
                 <w:i w:val="0"/>
-                <w:color w:val="B00020"/>
                 <w:sz w:val="20"/>
               </w:rPr>
-              <w:t>RA ____________</w:t>
+              <w:t>RA2311003012082</w:t>
             </w:r>
           </w:p>
         </w:tc>
@@ -710,10 +709,9 @@
               <w:rPr>
                 <w:b w:val="0"/>
                 <w:i w:val="0"/>
-                <w:color w:val="B00020"/>
                 <w:sz w:val="20"/>
               </w:rPr>
-              <w:t>RA ____________</w:t>
+              <w:t>RA2311003012121</w:t>
             </w:r>
           </w:p>
         </w:tc>
@@ -770,7 +768,7 @@
           <w:color w:val="5B6B77"/>
           <w:sz w:val="17"/>
         </w:rPr>
-        <w:t>Register numbers are left blank for the team to fill in.</w:t>
+        <w:t>Batch ID: B782  |  Department: CTECH</w:t>
       </w:r>
     </w:p>
     <w:p>
@@ -15273,7 +15271,7 @@
           <w:b w:val="0"/>
           <w:i w:val="0"/>
         </w:rPr>
-        <w:t>Guide signature and date: ______________________        Name: Dr. Eliazer M</w:t>
+        <w:t>Guide signature and date: ______________________        Name: Dr. M. Eliazer</w:t>
       </w:r>
     </w:p>
     <w:sectPr>

</xml_diff>